<commit_message>
Resume: GRC Analyst (Fresher / Intern) @ Unknown (unknown)
</commit_message>
<xml_diff>
--- a/resumes/Resume_GRC_Analyst__Fresher___Intern__Unknown__unknown_.docx
+++ b/resumes/Resume_GRC_Analyst__Fresher___Intern__Unknown__unknown_.docx
@@ -117,7 +117,7 @@
         <w:pBdr>
           <w:bottom w:val="single" w:sz="6" w:space="1" w:color="000000"/>
         </w:pBdr>
-        <w:spacing w:before="117" w:after="0"/>
+        <w:spacing w:before="32" w:after="0"/>
       </w:pPr>
       <w:r>
         <w:rPr>
@@ -289,7 +289,7 @@
     </w:p>
     <w:p>
       <w:pPr>
-        <w:spacing w:before="17" w:after="17"/>
+        <w:spacing w:before="2" w:after="2"/>
       </w:pPr>
     </w:p>
     <w:p>
@@ -297,7 +297,7 @@
         <w:pBdr>
           <w:bottom w:val="single" w:sz="6" w:space="1" w:color="000000"/>
         </w:pBdr>
-        <w:spacing w:before="117" w:after="0"/>
+        <w:spacing w:before="32" w:after="0"/>
       </w:pPr>
       <w:r>
         <w:rPr>
@@ -404,16 +404,16 @@
           <w:ilvl w:val="0"/>
           <w:numId w:val="2"/>
         </w:numPr>
-        <w:spacing w:before="13" w:after="35"/>
-      </w:pPr>
-      <w:r>
-        <w:rPr>
-          <w:rFonts w:ascii="Source Sans Pro" w:eastAsia="Source Sans Pro" w:hAnsi="Source Sans Pro" w:cs="Source Sans Pro"/>
-          <w:color w:val="000000"/>
-          <w:sz w:val="19"/>
-          <w:szCs w:val="19"/>
-        </w:rPr>
-        <w:t>Triaged 50+ weekly inventory cases by severity and policy eligibility, applied structured logic, documented decisions, and escalated edge cases over 80+ weeks.</w:t>
+        <w:spacing w:before="13" w:after="15"/>
+      </w:pPr>
+      <w:r>
+        <w:rPr>
+          <w:rFonts w:ascii="Source Sans Pro" w:eastAsia="Source Sans Pro" w:hAnsi="Source Sans Pro" w:cs="Source Sans Pro"/>
+          <w:color w:val="000000"/>
+          <w:sz w:val="19"/>
+          <w:szCs w:val="19"/>
+        </w:rPr>
+        <w:t>Documented investigation findings and corrective actions in audit-ready case notes for compliance tracking.</w:t>
       </w:r>
     </w:p>
     <w:p>
@@ -423,16 +423,16 @@
           <w:ilvl w:val="0"/>
           <w:numId w:val="2"/>
         </w:numPr>
-        <w:spacing w:before="13" w:after="35"/>
-      </w:pPr>
-      <w:r>
-        <w:rPr>
-          <w:rFonts w:ascii="Source Sans Pro" w:eastAsia="Source Sans Pro" w:hAnsi="Source Sans Pro" w:cs="Source Sans Pro"/>
-          <w:color w:val="000000"/>
-          <w:sz w:val="19"/>
-          <w:szCs w:val="19"/>
-        </w:rPr>
-        <w:t>Conducted root cause analysis on 20+ complex claims weekly, identifying policy violations and anomalous patterns, with 95%+ case accuracy.</w:t>
+        <w:spacing w:before="13" w:after="15"/>
+      </w:pPr>
+      <w:r>
+        <w:rPr>
+          <w:rFonts w:ascii="Source Sans Pro" w:eastAsia="Source Sans Pro" w:hAnsi="Source Sans Pro" w:cs="Source Sans Pro"/>
+          <w:color w:val="000000"/>
+          <w:sz w:val="19"/>
+          <w:szCs w:val="19"/>
+        </w:rPr>
+        <w:t>Analyzed 200+ weekly seller claims to identify policy risk and validate decisions against controls.</w:t>
       </w:r>
     </w:p>
     <w:p>
@@ -442,16 +442,16 @@
           <w:ilvl w:val="0"/>
           <w:numId w:val="2"/>
         </w:numPr>
-        <w:spacing w:before="13" w:after="35"/>
-      </w:pPr>
-      <w:r>
-        <w:rPr>
-          <w:rFonts w:ascii="Source Sans Pro" w:eastAsia="Source Sans Pro" w:hAnsi="Source Sans Pro" w:cs="Source Sans Pro"/>
-          <w:color w:val="000000"/>
-          <w:sz w:val="19"/>
-          <w:szCs w:val="19"/>
-        </w:rPr>
-        <w:t>Maintained structured case documentation across 500+ investigations, capturing key findings, decisions, actions, and audit trail for retrospective review and evidence retrieval.</w:t>
+        <w:spacing w:before="13" w:after="15"/>
+      </w:pPr>
+      <w:r>
+        <w:rPr>
+          <w:rFonts w:ascii="Source Sans Pro" w:eastAsia="Source Sans Pro" w:hAnsi="Source Sans Pro" w:cs="Source Sans Pro"/>
+          <w:color w:val="000000"/>
+          <w:sz w:val="19"/>
+          <w:szCs w:val="19"/>
+        </w:rPr>
+        <w:t>Investigated reimbursement cases for policy exceptions, flagging risk indicators and evidence gaps.</w:t>
       </w:r>
     </w:p>
     <w:p>
@@ -461,16 +461,16 @@
           <w:ilvl w:val="0"/>
           <w:numId w:val="2"/>
         </w:numPr>
-        <w:spacing w:before="17" w:after="17"/>
-      </w:pPr>
-      <w:r>
-        <w:rPr>
-          <w:rFonts w:ascii="Source Sans Pro" w:eastAsia="Source Sans Pro" w:hAnsi="Source Sans Pro" w:cs="Source Sans Pro"/>
-          <w:color w:val="000000"/>
-          <w:sz w:val="19"/>
-          <w:szCs w:val="19"/>
-        </w:rPr>
-        <w:t xml:space="preserve"> </w:t>
+        <w:spacing w:before="13" w:after="15"/>
+      </w:pPr>
+      <w:r>
+        <w:rPr>
+          <w:rFonts w:ascii="Source Sans Pro" w:eastAsia="Source Sans Pro" w:hAnsi="Source Sans Pro" w:cs="Source Sans Pro"/>
+          <w:color w:val="000000"/>
+          <w:sz w:val="19"/>
+          <w:szCs w:val="19"/>
+        </w:rPr>
+        <w:t>Triaged 50+ weekly cases by severity and eligibility, supporting audit documentation and control review.</w:t>
       </w:r>
       <w:r>
         <w:rPr>
@@ -494,14 +494,14 @@
     <w:p>
       <w:pPr>
         <w:pStyle w:val="ListParagraph"/>
-        <w:spacing w:before="17" w:after="17"/>
+        <w:spacing w:before="2" w:after="2"/>
         <w:ind w:left="450"/>
       </w:pPr>
     </w:p>
     <w:p>
       <w:pPr>
         <w:pStyle w:val="ListParagraph"/>
-        <w:spacing w:before="17" w:after="17"/>
+        <w:spacing w:before="2" w:after="2"/>
         <w:ind w:left="450"/>
       </w:pPr>
     </w:p>
@@ -510,7 +510,7 @@
         <w:pBdr>
           <w:bottom w:val="single" w:sz="6" w:space="1" w:color="000000"/>
         </w:pBdr>
-        <w:spacing w:before="117" w:after="0"/>
+        <w:spacing w:before="32" w:after="0"/>
       </w:pPr>
       <w:r>
         <w:rPr>
@@ -577,16 +577,16 @@
           <w:ilvl w:val="0"/>
           <w:numId w:val="2"/>
         </w:numPr>
-        <w:spacing w:before="13" w:after="35"/>
-      </w:pPr>
-      <w:r>
-        <w:rPr>
-          <w:rFonts w:ascii="Source Sans Pro" w:eastAsia="Source Sans Pro" w:hAnsi="Source Sans Pro" w:cs="Source Sans Pro"/>
-          <w:color w:val="000000"/>
-          <w:sz w:val="19"/>
-          <w:szCs w:val="19"/>
-        </w:rPr>
-        <w:t>Built multi-source risk assessment pipeline: submits vendor domains and IPs to VirusTotal, AbuseIPDB, URLScan.io, cross-references WHOIS, DNS, and SSL certificate details for EPSS scores.</w:t>
+        <w:spacing w:before="13" w:after="15"/>
+      </w:pPr>
+      <w:r>
+        <w:rPr>
+          <w:rFonts w:ascii="Source Sans Pro" w:eastAsia="Source Sans Pro" w:hAnsi="Source Sans Pro" w:cs="Source Sans Pro"/>
+          <w:color w:val="000000"/>
+          <w:sz w:val="19"/>
+          <w:szCs w:val="19"/>
+        </w:rPr>
+        <w:t>Built multi-API threat intelligence pipeline: submits suspicious URLs/IPs to VirusTotal, AbuseIPDB, and URLScan.io simultaneously; cross-references WHOIS registration age, DNS records, and SSL details to produce a unified phishing probability score.</w:t>
       </w:r>
     </w:p>
     <w:p>
@@ -596,16 +596,16 @@
           <w:ilvl w:val="0"/>
           <w:numId w:val="2"/>
         </w:numPr>
-        <w:spacing w:before="13" w:after="35"/>
-      </w:pPr>
-      <w:r>
-        <w:rPr>
-          <w:rFonts w:ascii="Source Sans Pro" w:eastAsia="Source Sans Pro" w:hAnsi="Source Sans Pro" w:cs="Source Sans Pro"/>
-          <w:color w:val="000000"/>
-          <w:sz w:val="19"/>
-          <w:szCs w:val="19"/>
-        </w:rPr>
-        <w:t>Implemented domain reputation assessment tool generating typosquatting variants of monitored domains and checking live DNS resolution for early brand-impersonation risk detection in vendor and partner ecosystems.</w:t>
+        <w:spacing w:before="13" w:after="15"/>
+      </w:pPr>
+      <w:r>
+        <w:rPr>
+          <w:rFonts w:ascii="Source Sans Pro" w:eastAsia="Source Sans Pro" w:hAnsi="Source Sans Pro" w:cs="Source Sans Pro"/>
+          <w:color w:val="000000"/>
+          <w:sz w:val="19"/>
+          <w:szCs w:val="19"/>
+        </w:rPr>
+        <w:t>Implemented typosquatting (brand impersonation detection) domain detector generating character-substitution variants of brand domains and checking live DNS resolution — catches brand-impersonation attacks before they reach threat feeds.</w:t>
       </w:r>
     </w:p>
     <w:p>
@@ -615,21 +615,21 @@
           <w:ilvl w:val="0"/>
           <w:numId w:val="2"/>
         </w:numPr>
-        <w:spacing w:before="13" w:after="35"/>
-      </w:pPr>
-      <w:r>
-        <w:rPr>
-          <w:rFonts w:ascii="Source Sans Pro" w:eastAsia="Source Sans Pro" w:hAnsi="Source Sans Pro" w:cs="Source Sans Pro"/>
-          <w:color w:val="000000"/>
-          <w:sz w:val="19"/>
-          <w:szCs w:val="19"/>
-        </w:rPr>
-        <w:t>Deployed Telegram bot for automated risk assessment interface, supporting bulk CSV input/output and OSINT enrichment via theHarvester.</w:t>
-      </w:r>
-    </w:p>
-    <w:p>
-      <w:pPr>
-        <w:spacing w:before="17" w:after="17"/>
+        <w:spacing w:before="13" w:after="15"/>
+      </w:pPr>
+      <w:r>
+        <w:rPr>
+          <w:rFonts w:ascii="Source Sans Pro" w:eastAsia="Source Sans Pro" w:hAnsi="Source Sans Pro" w:cs="Source Sans Pro"/>
+          <w:color w:val="000000"/>
+          <w:sz w:val="19"/>
+          <w:szCs w:val="19"/>
+        </w:rPr>
+        <w:t>Deployed Telegram bot interface enabling analysts to submit URLs for live IOC enrichment (threat intelligence); supports bulk CSV input/output for incident response workflows and includes OSINT enrichment (open-source intelligence) via theHarvester for domain profiling.</w:t>
+      </w:r>
+    </w:p>
+    <w:p>
+      <w:pPr>
+        <w:spacing w:before="2" w:after="2"/>
       </w:pPr>
     </w:p>
     <w:p>
@@ -685,16 +685,16 @@
           <w:ilvl w:val="0"/>
           <w:numId w:val="2"/>
         </w:numPr>
-        <w:spacing w:before="13" w:after="35"/>
-      </w:pPr>
-      <w:r>
-        <w:rPr>
-          <w:rFonts w:ascii="Source Sans Pro" w:eastAsia="Source Sans Pro" w:hAnsi="Source Sans Pro" w:cs="Source Sans Pro"/>
-          <w:color w:val="000000"/>
-          <w:sz w:val="19"/>
-          <w:szCs w:val="19"/>
-        </w:rPr>
-        <w:t>Built automated vulnerability assessment pipeline integrating Nessus and OpenVAS APIs, generating audit-ready CVE reports with EPSS scoring and CVSS severity, using FIRST.org API.</w:t>
+        <w:spacing w:before="13" w:after="15"/>
+      </w:pPr>
+      <w:r>
+        <w:rPr>
+          <w:rFonts w:ascii="Source Sans Pro" w:eastAsia="Source Sans Pro" w:hAnsi="Source Sans Pro" w:cs="Source Sans Pro"/>
+          <w:color w:val="000000"/>
+          <w:sz w:val="19"/>
+          <w:szCs w:val="19"/>
+        </w:rPr>
+        <w:t>Built automated vulnerability assessment pipeline integrating Nessus and OpenVAS REST APIs in Python; generates CVE reports classified by CVSS severity (vulnerability prioritisation); implemented EPSS scoring (exploit probability scoring) from FIRST.org API to prioritise by actual exploit probability — a metric rarely used by freshers.</w:t>
       </w:r>
     </w:p>
     <w:p>
@@ -704,16 +704,16 @@
           <w:ilvl w:val="0"/>
           <w:numId w:val="2"/>
         </w:numPr>
-        <w:spacing w:before="13" w:after="35"/>
-      </w:pPr>
-      <w:r>
-        <w:rPr>
-          <w:rFonts w:ascii="Source Sans Pro" w:eastAsia="Source Sans Pro" w:hAnsi="Source Sans Pro" w:cs="Source Sans Pro"/>
-          <w:color w:val="000000"/>
-          <w:sz w:val="19"/>
-          <w:szCs w:val="19"/>
-        </w:rPr>
-        <w:t>Developed OWASP Top 10 automated compliance checker validating web app security controls; documented vulnerability audit trails with SQL injection evidence and parameterised query fixes.</w:t>
+        <w:spacing w:before="13" w:after="15"/>
+      </w:pPr>
+      <w:r>
+        <w:rPr>
+          <w:rFonts w:ascii="Source Sans Pro" w:eastAsia="Source Sans Pro" w:hAnsi="Source Sans Pro" w:cs="Source Sans Pro"/>
+          <w:color w:val="000000"/>
+          <w:sz w:val="19"/>
+          <w:szCs w:val="19"/>
+        </w:rPr>
+        <w:t>Developed OWASP Top 10 (web application security) automated web checker that sends crafted HTTP requests to detect injection, broken auth, and SSRF vulnerabilities; documented SQL injection exploit and parameterised query remediation.</w:t>
       </w:r>
     </w:p>
     <w:p>
@@ -723,22 +723,22 @@
           <w:ilvl w:val="0"/>
           <w:numId w:val="2"/>
         </w:numPr>
-        <w:spacing w:before="13" w:after="35"/>
-      </w:pPr>
-      <w:r>
-        <w:rPr>
-          <w:rFonts w:ascii="Source Sans Pro" w:eastAsia="Source Sans Pro" w:hAnsi="Source Sans Pro" w:cs="Source Sans Pro"/>
-          <w:color w:val="000000"/>
-          <w:sz w:val="19"/>
-          <w:szCs w:val="19"/>
-        </w:rPr>
-        <w:t>Automated compliance scan scheduling via Bash, tracking remediation progress against SLA deadlines (24hr Critical, 7 days High, 30 days Medium) for patch compliance reporting.</w:t>
+        <w:spacing w:before="13" w:after="15"/>
+      </w:pPr>
+      <w:r>
+        <w:rPr>
+          <w:rFonts w:ascii="Source Sans Pro" w:eastAsia="Source Sans Pro" w:hAnsi="Source Sans Pro" w:cs="Source Sans Pro"/>
+          <w:color w:val="000000"/>
+          <w:sz w:val="19"/>
+          <w:szCs w:val="19"/>
+        </w:rPr>
+        <w:t>Automated scan scheduling via Bash and cron; built delta-scan logic to flag newly discovered CVEs and calculate remediation SLA deadlines (Critical=24hrs, High=7 days, Medium=30 days) for patch compliance (remediation tracking) tracking.</w:t>
       </w:r>
     </w:p>
     <w:p>
       <w:pPr>
         <w:pStyle w:val="ListParagraph"/>
-        <w:spacing w:before="17" w:after="17"/>
+        <w:spacing w:before="2" w:after="2"/>
         <w:ind w:left="450"/>
       </w:pPr>
     </w:p>
@@ -747,7 +747,7 @@
         <w:pBdr>
           <w:bottom w:val="single" w:sz="6" w:space="1" w:color="000000"/>
         </w:pBdr>
-        <w:spacing w:before="117" w:after="0"/>
+        <w:spacing w:before="32" w:after="0"/>
       </w:pPr>
       <w:r>
         <w:rPr>
@@ -763,7 +763,7 @@
     </w:p>
     <w:p>
       <w:pPr>
-        <w:spacing w:before="48" w:after="48"/>
+        <w:spacing w:before="27" w:after="27"/>
       </w:pPr>
       <w:r>
         <w:rPr>
@@ -785,7 +785,7 @@
     </w:p>
     <w:p>
       <w:pPr>
-        <w:spacing w:before="48" w:after="48"/>
+        <w:spacing w:before="27" w:after="27"/>
       </w:pPr>
       <w:r>
         <w:rPr>
@@ -807,7 +807,7 @@
     </w:p>
     <w:p>
       <w:pPr>
-        <w:spacing w:before="48" w:after="48"/>
+        <w:spacing w:before="27" w:after="27"/>
       </w:pPr>
       <w:r>
         <w:rPr>
@@ -829,7 +829,7 @@
     </w:p>
     <w:p>
       <w:pPr>
-        <w:spacing w:before="48" w:after="48"/>
+        <w:spacing w:before="27" w:after="27"/>
       </w:pPr>
       <w:r>
         <w:rPr>
@@ -851,7 +851,7 @@
     </w:p>
     <w:p>
       <w:pPr>
-        <w:spacing w:before="48" w:after="48"/>
+        <w:spacing w:before="27" w:after="27"/>
       </w:pPr>
       <w:r>
         <w:rPr>
@@ -876,7 +876,7 @@
         <w:pBdr>
           <w:bottom w:val="single" w:sz="6" w:space="1" w:color="000000"/>
         </w:pBdr>
-        <w:spacing w:before="17" w:after="17"/>
+        <w:spacing w:before="2" w:after="2"/>
         <w:rPr>
           <w:rFonts w:ascii="Source Sans Pro" w:eastAsia="Source Sans Pro" w:hAnsi="Source Sans Pro" w:cs="Source Sans Pro"/>
           <w:b/>
@@ -892,7 +892,7 @@
         <w:pBdr>
           <w:bottom w:val="single" w:sz="6" w:space="1" w:color="000000"/>
         </w:pBdr>
-        <w:spacing w:before="117" w:after="0"/>
+        <w:spacing w:before="32" w:after="0"/>
       </w:pPr>
       <w:r>
         <w:rPr>
@@ -913,7 +913,7 @@
           <w:ilvl w:val="0"/>
           <w:numId w:val="2"/>
         </w:numPr>
-        <w:spacing w:before="13" w:after="35"/>
+        <w:spacing w:before="13" w:after="15"/>
       </w:pPr>
       <w:r>
         <w:rPr>
@@ -932,7 +932,7 @@
           <w:ilvl w:val="0"/>
           <w:numId w:val="2"/>
         </w:numPr>
-        <w:spacing w:before="13" w:after="35"/>
+        <w:spacing w:before="13" w:after="15"/>
       </w:pPr>
       <w:r>
         <w:rPr>

</xml_diff>